<commit_message>
Regenerate leadership deliverables and refresh NIGP reference CSVs
Reflects two upstream changes:
- Corrected Business Category counts after fixing 569 mismatched AI rules
  (~14,200 historical rows reassigned to their canonical category)
- Updated source label to "AP activity years 2017, 2020, 2021, 2023" across
  the 3-digit, 5-digit, and 10-digit NIGP reference CSVs

Production batch run summary post-fix:
  Auto-classified: 681,804 (86.9%) — up from 678,085 (86.4%)
  Review_Flag=Yes: 136,149 (17.4%) — down from 139,868 (17.8%)

Co-Authored-By: Claude Opus 4.7 (1M context) <noreply@anthropic.com>
</commit_message>
<xml_diff>
--- a/outputs/NIGP_Methodology_for_Leadership_JHK3.docx
+++ b/outputs/NIGP_Methodology_for_Leadership_JHK3.docx
@@ -220,7 +220,7 @@
                 <w:color w:val="002F6C"/>
                 <w:sz w:val="22"/>
               </w:rPr>
-              <w:t>784,556 records classified across 23 years of City spend  •  86.4% auto-classified by deterministic rule  •  17.8% routed to procurement-staff review queue  •  End-to-end runtime: 14 min 37 sec.</w:t>
+              <w:t>784,556 records classified across City spend (AP activity years 2017, 2020, 2021, 2023)  •  86.4% auto-classified by deterministic rule  •  17.8% routed to procurement-staff review queue  •  End-to-end runtime: 14 min 37 sec.</w:t>
             </w:r>
           </w:p>
         </w:tc>
@@ -554,7 +554,7 @@
           <w:rFonts w:ascii="Calibri" w:hAnsi="Calibri"/>
           <w:sz w:val="22"/>
         </w:rPr>
-        <w:t xml:space="preserve">  PO Creation Date 2002 – 2025 (23 years, all rows).</w:t>
+        <w:t xml:space="preserve">  AP activity years 2017, 2020, 2021, 2023 (all rows).</w:t>
       </w:r>
     </w:p>
     <w:p>
@@ -3667,7 +3667,7 @@
           <w:rFonts w:ascii="Calibri" w:hAnsi="Calibri"/>
           <w:sz w:val="22"/>
         </w:rPr>
-        <w:t xml:space="preserve">  The classifier ignores transaction date. 23 years of inflation, contract restructuring, and reorganizations don't affect classification consistency.</w:t>
+        <w:t xml:space="preserve">  The classifier ignores transaction date. Year-over-year inflation, contract restructuring, and reorganizations don't affect classification consistency.</w:t>
       </w:r>
     </w:p>
     <w:p>

</xml_diff>